<commit_message>
P3.18: harden English submission package
</commit_message>
<xml_diff>
--- a/docs/submission/DejaView-Project-Specification.docx
+++ b/docs/submission/DejaView-Project-Specification.docx
@@ -3708,7 +3708,7 @@
         <w:rPr>
           <w:rFonts w:ascii="Calibri" w:hAnsi="Calibri" w:eastAsia="Calibri"/>
         </w:rPr>
-        <w:t xml:space="preserve"> demo. The current accepted video is </w:t>
+        <w:t xml:space="preserve"> demo. The accepted evidence cut is </w:t>
       </w:r>
       <w:r>
         <w:rPr>
@@ -3721,20 +3721,7 @@
         <w:rPr>
           <w:rFonts w:ascii="Calibri" w:hAnsi="Calibri" w:eastAsia="Calibri"/>
         </w:rPr>
-        <w:t xml:space="preserve"> (157.2 seconds). The team will submit the current video and will </w:t>
-      </w:r>
-      <w:r>
-        <w:rPr>
-          <w:rFonts w:ascii="Calibri" w:hAnsi="Calibri" w:eastAsia="Calibri"/>
-          <w:b/>
-        </w:rPr>
-        <w:t>not</w:t>
-      </w:r>
-      <w:r>
-        <w:rPr>
-          <w:rFonts w:ascii="Calibri" w:hAnsi="Calibri" w:eastAsia="Calibri"/>
-        </w:rPr>
-        <w:t xml:space="preserve"> re-record it; the duration difference is disclosed rather than hidden.</w:t>
+        <w:t xml:space="preserve"> (157.2 seconds). It remains unchanged; the submission package adds complete burned-in English captions plus an editable SRT. The duration difference is disclosed rather than hidden.</w:t>
       </w:r>
     </w:p>
     <w:p>
@@ -3858,7 +3845,7 @@
         <w:rPr>
           <w:rFonts w:ascii="Calibri" w:hAnsi="Calibri" w:eastAsia="Calibri"/>
         </w:rPr>
-        <w:t>☑ Current 2:37 video retained; official 3–5 minute recommendation disclosed; no re-record planned.</w:t>
+        <w:t>☑ Original 2:37 evidence cut retained; English-captioned submission cut and editable SRT supplied; official 3–5 minute recommendation disclosed.</w:t>
       </w:r>
     </w:p>
     <w:p>
@@ -4125,7 +4112,7 @@
         <w:rPr>
           <w:rFonts w:ascii="Calibri" w:hAnsi="Calibri" w:eastAsia="Calibri"/>
         </w:rPr>
-        <w:t xml:space="preserve"> with the accepted MP4.</w:t>
+        <w:t xml:space="preserve"> with both the accepted evidence MP4 and English-captioned submission MP4.</w:t>
       </w:r>
     </w:p>
     <w:sectPr>

</xml_diff>

<commit_message>
feat: checkpoint P3.19 submission hardening
</commit_message>
<xml_diff>
--- a/docs/submission/DejaView-Project-Specification.docx
+++ b/docs/submission/DejaView-Project-Specification.docx
@@ -150,7 +150,7 @@
           <w:color w:val="1F4D78"/>
           <w:sz w:val="21"/>
         </w:rPr>
-        <w:t>Submission truth boundary — Five logical model roles do not imply simultaneous residency. ROCm claims are limited to measured cells, and the accepted 2:37 video is disclosed against the official 3–5 minute recommendation.</w:t>
+        <w:t>Submission truth boundary — Five logical model roles do not imply simultaneous residency. ROCm claims are limited to measured cells; the immutable 2:37 evidence cut and the compliant 3:15.2 English-primary submission cut are recorded separately.</w:t>
       </w:r>
     </w:p>
     <w:p>
@@ -3695,20 +3695,7 @@
         <w:rPr>
           <w:rFonts w:ascii="Calibri" w:hAnsi="Calibri" w:eastAsia="Calibri"/>
         </w:rPr>
-        <w:t xml:space="preserve">The official submission guidance recommends a </w:t>
-      </w:r>
-      <w:r>
-        <w:rPr>
-          <w:rFonts w:ascii="Calibri" w:hAnsi="Calibri" w:eastAsia="Calibri"/>
-          <w:b/>
-        </w:rPr>
-        <w:t>3–5 minute</w:t>
-      </w:r>
-      <w:r>
-        <w:rPr>
-          <w:rFonts w:ascii="Calibri" w:hAnsi="Calibri" w:eastAsia="Calibri"/>
-        </w:rPr>
-        <w:t xml:space="preserve"> demo. The accepted evidence cut is </w:t>
+        <w:t xml:space="preserve">The accepted evidence cut remains unchanged at </w:t>
       </w:r>
       <w:r>
         <w:rPr>
@@ -3721,7 +3708,20 @@
         <w:rPr>
           <w:rFonts w:ascii="Calibri" w:hAnsi="Calibri" w:eastAsia="Calibri"/>
         </w:rPr>
-        <w:t xml:space="preserve"> (157.2 seconds). It remains unchanged; the submission package adds complete burned-in English captions plus an editable SRT. The duration difference is disclosed rather than hidden.</w:t>
+        <w:t xml:space="preserve"> (157.2 seconds). The submission package adds a </w:t>
+      </w:r>
+      <w:r>
+        <w:rPr>
+          <w:rFonts w:ascii="Calibri" w:hAnsi="Calibri" w:eastAsia="Calibri"/>
+          <w:b/>
+        </w:rPr>
+        <w:t>3:15.2 English-primary</w:t>
+      </w:r>
+      <w:r>
+        <w:rPr>
+          <w:rFonts w:ascii="Calibri" w:hAnsi="Calibri" w:eastAsia="Calibri"/>
+        </w:rPr>
+        <w:t xml:space="preserve"> cut with authentic evidence slides, unchanged live-run visuals, replacement English narration, and an editable full-length SRT. It is within the official 3–5 minute window.</w:t>
       </w:r>
     </w:p>
     <w:p>
@@ -3845,7 +3845,7 @@
         <w:rPr>
           <w:rFonts w:ascii="Calibri" w:hAnsi="Calibri" w:eastAsia="Calibri"/>
         </w:rPr>
-        <w:t>☑ Original 2:37 evidence cut retained; English-captioned submission cut and editable SRT supplied; official 3–5 minute recommendation disclosed.</w:t>
+        <w:t>☑ Original 2:37 evidence cut retained; 3:15.2 English-primary submission cut and editable SRT supplied within the official 3–5 minute window.</w:t>
       </w:r>
     </w:p>
     <w:p>
@@ -4112,7 +4112,7 @@
         <w:rPr>
           <w:rFonts w:ascii="Calibri" w:hAnsi="Calibri" w:eastAsia="Calibri"/>
         </w:rPr>
-        <w:t xml:space="preserve"> with both the accepted evidence MP4 and English-captioned submission MP4.</w:t>
+        <w:t xml:space="preserve"> with immutable 2:37 evidence and English-primary 3:15.2 submission MP4s.</w:t>
       </w:r>
     </w:p>
     <w:sectPr>

</xml_diff>